<commit_message>
Introduction and problem attempt
</commit_message>
<xml_diff>
--- a/New Microsoft Word Document.docx
+++ b/New Microsoft Word Document.docx
@@ -19,7 +19,16 @@
     </w:p>
     <w:p>
       <w:r>
-        <w:t>Predicting the optimal time to sell a property across Cork City and County. This is a data driven approach for Property Investment Ltd.</w:t>
+        <w:t>‘</w:t>
+      </w:r>
+      <w:r>
+        <w:t>Predicting the optimal time to sell a property across Cork City and County</w:t>
+      </w:r>
+      <w:r>
+        <w:t>’</w:t>
+      </w:r>
+      <w:r>
+        <w:t>. This is a data driven approach for Property Investment Ltd.</w:t>
       </w:r>
     </w:p>
     <w:p/>
@@ -38,7 +47,29 @@
         <w:t>Introduction</w:t>
       </w:r>
     </w:p>
-    <w:p/>
+    <w:p>
+      <w:r>
+        <w:t xml:space="preserve">Property Investment Ltd. is a property investment company based in Cork. The company owns 20 properties around Cork City and County comprising of both houses and apartments. The company was started in 1982 and built up its property portfolio over time. It has amassed the 20 properties over this period; the last property being purchased in the early 2000s before the Celtic Tiger and the crash. The value of these properties has risen drastically since that point. Cork has one of the fastest growing property prices in Ireland, in fact Dublin is the only place that beats it. In Cork City alone prices have risen by 1.2% in the last 3 months. The asking price is now €420,000 for a second hand 3-bedroom semi detached house. </w:t>
+      </w:r>
+      <w:r>
+        <w:fldChar w:fldCharType="begin"/>
+      </w:r>
+      <w:r>
+        <w:instrText xml:space="preserve"> ADDIN ZOTERO_ITEM CSL_CITATION {"citationID":"WbAs0UoK","properties":{"unsorted":false,"formattedCitation":"(Fox, 2026)","plainCitation":"(Fox, 2026)","noteIndex":0},"citationItems":[{"id":208,"uris":["http://zotero.org/users/local/QBRbeKka/items/HAVVQVKI"],"itemData":{"id":208,"type":"webpage","abstract":"Average house prices in Cork city have increased by 1.2% in the past three months, according to a national survey conducted by the Real Estate Alliance (REA).","container-title":"Cork Independent","language":"en-US","title":"House prices rise again across Cork","URL":"https://www.corkindependent.com/2026/06/23/house-prices-rise-again-across-cork/","author":[{"family":"Fox","given":"Steven"}],"accessed":{"date-parts":[["2026",10,13]]},"issued":{"date-parts":[["2026",6,23]]}}}],"schema":"https://github.com/citation-style-language/schema/raw/master/csl-citation.json"} </w:instrText>
+      </w:r>
+      <w:r>
+        <w:fldChar w:fldCharType="separate"/>
+      </w:r>
+      <w:r>
+        <w:rPr>
+          <w:rFonts w:ascii="Aptos" w:hAnsi="Aptos"/>
+        </w:rPr>
+        <w:t>(Fox, 2026)</w:t>
+      </w:r>
+      <w:r>
+        <w:fldChar w:fldCharType="end"/>
+      </w:r>
+    </w:p>
     <w:p/>
     <w:p/>
     <w:p>
@@ -56,7 +87,14 @@
         <w:t>Problem Definition</w:t>
       </w:r>
     </w:p>
-    <w:p/>
+    <w:p>
+      <w:r>
+        <w:t xml:space="preserve">The pressing issue for Property Investment Ltd. are the new </w:t>
+      </w:r>
+      <w:r>
+        <w:t xml:space="preserve">rent controls that are having a huge impact on landlords. They have resulted in landlords leaving the market. </w:t>
+      </w:r>
+    </w:p>
     <w:p/>
     <w:p/>
     <w:p>
@@ -332,11 +370,67 @@
     </w:p>
     <w:p>
       <w:pPr>
-        <w:rPr>
-          <w:b/>
-          <w:bCs/>
-        </w:rPr>
-      </w:pPr>
+        <w:pStyle w:val="Bibliography"/>
+      </w:pPr>
+      <w:r>
+        <w:rPr>
+          <w:b/>
+          <w:bCs/>
+        </w:rPr>
+        <w:fldChar w:fldCharType="begin"/>
+      </w:r>
+      <w:r>
+        <w:rPr>
+          <w:b/>
+          <w:bCs/>
+        </w:rPr>
+        <w:instrText xml:space="preserve"> ADDIN ZOTERO_BIBL {"uncited":[],"omitted":[],"custom":[]} CSL_BIBLIOGRAPHY </w:instrText>
+      </w:r>
+      <w:r>
+        <w:rPr>
+          <w:b/>
+          <w:bCs/>
+        </w:rPr>
+        <w:fldChar w:fldCharType="separate"/>
+      </w:r>
+      <w:r>
+        <w:t xml:space="preserve">Fox, S. (2026) </w:t>
+      </w:r>
+      <w:r>
+        <w:rPr>
+          <w:i/>
+          <w:iCs/>
+        </w:rPr>
+        <w:t>House prices rise again across Cork</w:t>
+      </w:r>
+      <w:r>
+        <w:t xml:space="preserve">, </w:t>
+      </w:r>
+      <w:r>
+        <w:rPr>
+          <w:i/>
+          <w:iCs/>
+        </w:rPr>
+        <w:t>Cork Independent</w:t>
+      </w:r>
+      <w:r>
+        <w:t>. Available at: https://www.corkindependent.com/2026/06/23/house-prices-rise-again-across-cork/ (Accessed: 13 October 2026).</w:t>
+      </w:r>
+    </w:p>
+    <w:p>
+      <w:pPr>
+        <w:rPr>
+          <w:b/>
+          <w:bCs/>
+        </w:rPr>
+      </w:pPr>
+      <w:r>
+        <w:rPr>
+          <w:b/>
+          <w:bCs/>
+        </w:rPr>
+        <w:fldChar w:fldCharType="end"/>
+      </w:r>
     </w:p>
     <w:sectPr>
       <w:headerReference w:type="default" r:id="rId7"/>
@@ -1026,7 +1120,6 @@
   <w:style w:type="character" w:default="1" w:styleId="DefaultParagraphFont">
     <w:name w:val="Default Paragraph Font"/>
     <w:uiPriority w:val="1"/>
-    <w:semiHidden/>
     <w:unhideWhenUsed/>
   </w:style>
   <w:style w:type="table" w:default="1" w:styleId="TableNormal">
@@ -1383,6 +1476,17 @@
     <w:link w:val="Footer"/>
     <w:uiPriority w:val="99"/>
     <w:rsid w:val="00190CA5"/>
+  </w:style>
+  <w:style w:type="paragraph" w:styleId="Bibliography">
+    <w:name w:val="Bibliography"/>
+    <w:basedOn w:val="Normal"/>
+    <w:next w:val="Normal"/>
+    <w:uiPriority w:val="37"/>
+    <w:unhideWhenUsed/>
+    <w:rsid w:val="00853FF5"/>
+    <w:pPr>
+      <w:spacing w:after="240" w:line="240" w:lineRule="auto"/>
+    </w:pPr>
   </w:style>
 </w:styles>
 </file>

</xml_diff>

<commit_message>
defining the aims and objectives
</commit_message>
<xml_diff>
--- a/New Microsoft Word Document.docx
+++ b/New Microsoft Word Document.docx
@@ -186,7 +186,10 @@
         <w:t xml:space="preserve">. The problem for Property Investment Ltd., is that the company relies on agent advice to inform them of when is the right time to sell. This may not be backed by data to prove whether it is the best time to sell for the company to maximise the returns. By doing some data analysis on publicly available data, it is possible to reveal that there are seasonal and regional patterns in terms of historic </w:t>
       </w:r>
       <w:r>
-        <w:t>sales price</w:t>
+        <w:t xml:space="preserve">sales </w:t>
+      </w:r>
+      <w:r>
+        <w:t>price,</w:t>
       </w:r>
       <w:r>
         <w:t xml:space="preserve"> and a predictive modelling approach </w:t>
@@ -212,22 +215,85 @@
         <w:t>Aim and Objectives</w:t>
       </w:r>
     </w:p>
-    <w:p/>
-    <w:p/>
-    <w:p/>
-    <w:p>
-      <w:pPr>
-        <w:rPr>
-          <w:b/>
-          <w:bCs/>
-        </w:rPr>
-      </w:pPr>
-      <w:r>
-        <w:rPr>
-          <w:b/>
-          <w:bCs/>
-        </w:rPr>
+    <w:p>
+      <w:r>
+        <w:t xml:space="preserve">The aim of this project is to develop a predictive solution to help Property Investment Ltd, decide on when is the best time to sell each of its 20 properties. </w:t>
+      </w:r>
+    </w:p>
+    <w:p>
+      <w:r>
+        <w:t>The objectives of this capstone project are:</w:t>
+      </w:r>
+    </w:p>
+    <w:p>
+      <w:pPr>
+        <w:pStyle w:val="ListParagraph"/>
+        <w:numPr>
+          <w:ilvl w:val="0"/>
+          <w:numId w:val="1"/>
+        </w:numPr>
+      </w:pPr>
+      <w:r>
+        <w:t>Collect and</w:t>
+      </w:r>
+      <w:r>
+        <w:t xml:space="preserve"> clean Cork residential property sales over the last 10 years.</w:t>
+      </w:r>
+    </w:p>
+    <w:p>
+      <w:pPr>
+        <w:pStyle w:val="ListParagraph"/>
+        <w:numPr>
+          <w:ilvl w:val="0"/>
+          <w:numId w:val="1"/>
+        </w:numPr>
+      </w:pPr>
+      <w:r>
         <w:lastRenderedPageBreak/>
+        <w:t>Make location a feature from the dataset, Eircode’s are widely available from 2022-2026 but prior to this they are not used.</w:t>
+      </w:r>
+    </w:p>
+    <w:p>
+      <w:pPr>
+        <w:pStyle w:val="ListParagraph"/>
+        <w:numPr>
+          <w:ilvl w:val="0"/>
+          <w:numId w:val="1"/>
+        </w:numPr>
+      </w:pPr>
+      <w:r>
+        <w:t>Analyse the sale prices to identify any trends in terms of seasonality, region or property time</w:t>
+      </w:r>
+      <w:r>
+        <w:t>.</w:t>
+      </w:r>
+    </w:p>
+    <w:p>
+      <w:pPr>
+        <w:pStyle w:val="ListParagraph"/>
+        <w:numPr>
+          <w:ilvl w:val="0"/>
+          <w:numId w:val="1"/>
+        </w:numPr>
+      </w:pPr>
+      <w:r>
+        <w:t>Create a dashboard recommending the best timeframe for Property Investment Ltd. to sell their portfolio.</w:t>
+      </w:r>
+    </w:p>
+    <w:p/>
+    <w:p/>
+    <w:p>
+      <w:pPr>
+        <w:rPr>
+          <w:b/>
+          <w:bCs/>
+        </w:rPr>
+      </w:pPr>
+      <w:r>
+        <w:rPr>
+          <w:b/>
+          <w:bCs/>
+        </w:rPr>
         <w:t>Scope</w:t>
       </w:r>
     </w:p>
@@ -323,6 +389,7 @@
           <w:b/>
           <w:bCs/>
         </w:rPr>
+        <w:lastRenderedPageBreak/>
         <w:t>Ethical and Legal Considerations</w:t>
       </w:r>
     </w:p>
@@ -564,7 +631,7 @@
       </w:r>
     </w:p>
     <w:sectPr>
-      <w:headerReference w:type="default" r:id="rId7"/>
+      <w:headerReference w:type="default" r:id="rId8"/>
       <w:pgSz w:w="11906" w:h="16838"/>
       <w:pgMar w:top="1440" w:right="1440" w:bottom="1440" w:left="1440" w:header="708" w:footer="708" w:gutter="0"/>
       <w:cols w:space="708"/>
@@ -643,6 +710,100 @@
     </w:r>
   </w:p>
 </w:hdr>
+</file>
+
+<file path=word/numbering.xml><?xml version="1.0" encoding="utf-8"?>
+<w:numbering xmlns:wpc="http://schemas.microsoft.com/office/word/2010/wordprocessingCanvas" xmlns:cx="http://schemas.microsoft.com/office/drawing/2014/chartex" xmlns:cx1="http://schemas.microsoft.com/office/drawing/2015/9/8/chartex" xmlns:cx2="http://schemas.microsoft.com/office/drawing/2015/10/21/chartex" xmlns:cx3="http://schemas.microsoft.com/office/drawing/2016/5/9/chartex" xmlns:cx4="http://schemas.microsoft.com/office/drawing/2016/5/10/chartex" xmlns:cx5="http://schemas.microsoft.com/office/drawing/2016/5/11/chartex" xmlns:cx6="http://schemas.microsoft.com/office/drawing/2016/5/12/chartex" xmlns:cx7="http://schemas.microsoft.com/office/drawing/2016/5/13/chartex" xmlns:cx8="http://schemas.microsoft.com/office/drawing/2016/5/14/chartex" xmlns:mc="http://schemas.openxmlformats.org/markup-compatibility/2006" xmlns:aink="http://schemas.microsoft.com/office/drawing/2016/ink" xmlns:am3d="http://schemas.microsoft.com/office/drawing/2017/model3d" xmlns:o="urn:schemas-microsoft-com:office:office" xmlns:oel="http://schemas.microsoft.com/office/2019/extlst" xmlns:r="http://schemas.openxmlformats.org/officeDocument/2006/relationships" xmlns:m="http://schemas.openxmlformats.org/officeDocument/2006/math" xmlns:v="urn:schemas-microsoft-com:vml" xmlns:wp14="http://schemas.microsoft.com/office/word/2010/wordprocessingDrawing" xmlns:wp="http://schemas.openxmlformats.org/drawingml/2006/wordprocessingDrawing" xmlns:w10="urn:schemas-microsoft-com:office:word" xmlns:w="http://schemas.openxmlformats.org/wordprocessingml/2006/main" xmlns:w14="http://schemas.microsoft.com/office/word/2010/wordml" xmlns:w15="http://schemas.microsoft.com/office/word/2012/wordml" xmlns:w16cex="http://schemas.microsoft.com/office/word/2018/wordml/cex" xmlns:w16cid="http://schemas.microsoft.com/office/word/2016/wordml/cid" xmlns:w16="http://schemas.microsoft.com/office/word/2018/wordml" xmlns:w16du="http://schemas.microsoft.com/office/word/2023/wordml/word16du" xmlns:w16sdtdh="http://schemas.microsoft.com/office/word/2020/wordml/sdtdatahash" xmlns:w16sdtfl="http://schemas.microsoft.com/office/word/2024/wordml/sdtformatlock" xmlns:w16se="http://schemas.microsoft.com/office/word/2015/wordml/symex" xmlns:wpg="http://schemas.microsoft.com/office/word/2010/wordprocessingGroup" xmlns:wpi="http://schemas.microsoft.com/office/word/2010/wordprocessingInk" xmlns:wne="http://schemas.microsoft.com/office/word/2006/wordml" xmlns:wps="http://schemas.microsoft.com/office/word/2010/wordprocessingShape" mc:Ignorable="w14 w15 w16se w16cid w16 w16cex w16sdtdh w16sdtfl w16du wp14">
+  <w:abstractNum w:abstractNumId="0" w15:restartNumberingAfterBreak="0">
+    <w:nsid w:val="151501E1"/>
+    <w:multiLevelType w:val="hybridMultilevel"/>
+    <w:tmpl w:val="85CA35E0"/>
+    <w:lvl w:ilvl="0" w:tplc="1809000F">
+      <w:start w:val="1"/>
+      <w:numFmt w:val="decimal"/>
+      <w:lvlText w:val="%1."/>
+      <w:lvlJc w:val="left"/>
+      <w:pPr>
+        <w:ind w:left="720" w:hanging="360"/>
+      </w:pPr>
+    </w:lvl>
+    <w:lvl w:ilvl="1" w:tplc="18090019" w:tentative="1">
+      <w:start w:val="1"/>
+      <w:numFmt w:val="lowerLetter"/>
+      <w:lvlText w:val="%2."/>
+      <w:lvlJc w:val="left"/>
+      <w:pPr>
+        <w:ind w:left="1440" w:hanging="360"/>
+      </w:pPr>
+    </w:lvl>
+    <w:lvl w:ilvl="2" w:tplc="1809001B" w:tentative="1">
+      <w:start w:val="1"/>
+      <w:numFmt w:val="lowerRoman"/>
+      <w:lvlText w:val="%3."/>
+      <w:lvlJc w:val="right"/>
+      <w:pPr>
+        <w:ind w:left="2160" w:hanging="180"/>
+      </w:pPr>
+    </w:lvl>
+    <w:lvl w:ilvl="3" w:tplc="1809000F" w:tentative="1">
+      <w:start w:val="1"/>
+      <w:numFmt w:val="decimal"/>
+      <w:lvlText w:val="%4."/>
+      <w:lvlJc w:val="left"/>
+      <w:pPr>
+        <w:ind w:left="2880" w:hanging="360"/>
+      </w:pPr>
+    </w:lvl>
+    <w:lvl w:ilvl="4" w:tplc="18090019" w:tentative="1">
+      <w:start w:val="1"/>
+      <w:numFmt w:val="lowerLetter"/>
+      <w:lvlText w:val="%5."/>
+      <w:lvlJc w:val="left"/>
+      <w:pPr>
+        <w:ind w:left="3600" w:hanging="360"/>
+      </w:pPr>
+    </w:lvl>
+    <w:lvl w:ilvl="5" w:tplc="1809001B" w:tentative="1">
+      <w:start w:val="1"/>
+      <w:numFmt w:val="lowerRoman"/>
+      <w:lvlText w:val="%6."/>
+      <w:lvlJc w:val="right"/>
+      <w:pPr>
+        <w:ind w:left="4320" w:hanging="180"/>
+      </w:pPr>
+    </w:lvl>
+    <w:lvl w:ilvl="6" w:tplc="1809000F" w:tentative="1">
+      <w:start w:val="1"/>
+      <w:numFmt w:val="decimal"/>
+      <w:lvlText w:val="%7."/>
+      <w:lvlJc w:val="left"/>
+      <w:pPr>
+        <w:ind w:left="5040" w:hanging="360"/>
+      </w:pPr>
+    </w:lvl>
+    <w:lvl w:ilvl="7" w:tplc="18090019" w:tentative="1">
+      <w:start w:val="1"/>
+      <w:numFmt w:val="lowerLetter"/>
+      <w:lvlText w:val="%8."/>
+      <w:lvlJc w:val="left"/>
+      <w:pPr>
+        <w:ind w:left="5760" w:hanging="360"/>
+      </w:pPr>
+    </w:lvl>
+    <w:lvl w:ilvl="8" w:tplc="1809001B" w:tentative="1">
+      <w:start w:val="1"/>
+      <w:numFmt w:val="lowerRoman"/>
+      <w:lvlText w:val="%9."/>
+      <w:lvlJc w:val="right"/>
+      <w:pPr>
+        <w:ind w:left="6480" w:hanging="180"/>
+      </w:pPr>
+    </w:lvl>
+  </w:abstractNum>
+  <w:num w:numId="1" w16cid:durableId="99839840">
+    <w:abstractNumId w:val="0"/>
+  </w:num>
+</w:numbering>
 </file>
 
 <file path=word/styles.xml><?xml version="1.0" encoding="utf-8"?>

</xml_diff>